<commit_message>
Replace week 3 math answer
</commit_message>
<xml_diff>
--- a/周练3答案.docx
+++ b/周练3答案.docx
@@ -7,132 +7,9 @@
         <w:rPr>
           <w:rFonts w:ascii="Times New Roman" w:eastAsia="新宋体" w:hAnsi="Times New Roman" w:hint="eastAsia"/>
           <w:b/>
-          <w:noProof/>
-          <w:szCs w:val="21"/>
-        </w:rPr>
-        <w:drawing>
-          <wp:inline distT="0" distB="0" distL="0" distR="0" wp14:anchorId="17D01DB8" wp14:editId="01D02A9F">
-            <wp:extent cx="6115050" cy="7258050"/>
-            <wp:effectExtent l="0" t="0" r="0" b="0"/>
-            <wp:docPr id="1715688351" name="图片 1"/>
-            <wp:cNvGraphicFramePr>
-              <a:graphicFrameLocks xmlns:a="http://schemas.openxmlformats.org/drawingml/2006/main" noChangeAspect="1"/>
-            </wp:cNvGraphicFramePr>
-            <a:graphic xmlns:a="http://schemas.openxmlformats.org/drawingml/2006/main">
-              <a:graphicData uri="http://schemas.openxmlformats.org/drawingml/2006/picture">
-                <pic:pic xmlns:pic="http://schemas.openxmlformats.org/drawingml/2006/picture">
-                  <pic:nvPicPr>
-                    <pic:cNvPr id="0" name="Picture 1"/>
-                    <pic:cNvPicPr>
-                      <a:picLocks noChangeAspect="1" noChangeArrowheads="1"/>
-                    </pic:cNvPicPr>
-                  </pic:nvPicPr>
-                  <pic:blipFill>
-                    <a:blip r:embed="rId7">
-                      <a:extLst>
-                        <a:ext uri="{28A0092B-C50C-407E-A947-70E740481C1C}">
-                          <a14:useLocalDpi xmlns:a14="http://schemas.microsoft.com/office/drawing/2010/main" val="0"/>
-                        </a:ext>
-                      </a:extLst>
-                    </a:blip>
-                    <a:srcRect/>
-                    <a:stretch>
-                      <a:fillRect/>
-                    </a:stretch>
-                  </pic:blipFill>
-                  <pic:spPr bwMode="auto">
-                    <a:xfrm>
-                      <a:off x="0" y="0"/>
-                      <a:ext cx="6115050" cy="7258050"/>
-                    </a:xfrm>
-                    <a:prstGeom prst="rect">
-                      <a:avLst/>
-                    </a:prstGeom>
-                    <a:noFill/>
-                    <a:ln>
-                      <a:noFill/>
-                    </a:ln>
-                  </pic:spPr>
-                </pic:pic>
-              </a:graphicData>
-            </a:graphic>
-          </wp:inline>
-        </w:drawing>
-      </w:r>
-      <w:r>
-        <w:rPr>
-          <w:rFonts w:ascii="Times New Roman" w:eastAsia="新宋体" w:hAnsi="Times New Roman" w:hint="eastAsia"/>
-          <w:b/>
-          <w:noProof/>
-          <w:szCs w:val="21"/>
-        </w:rPr>
-        <w:lastRenderedPageBreak/>
-        <w:drawing>
-          <wp:inline distT="0" distB="0" distL="0" distR="0" wp14:anchorId="1CBC6B04" wp14:editId="1F16F600">
-            <wp:extent cx="6115050" cy="7111365"/>
-            <wp:effectExtent l="0" t="0" r="0" b="0"/>
-            <wp:docPr id="1362081721" name="图片 2"/>
-            <wp:cNvGraphicFramePr>
-              <a:graphicFrameLocks xmlns:a="http://schemas.openxmlformats.org/drawingml/2006/main" noChangeAspect="1"/>
-            </wp:cNvGraphicFramePr>
-            <a:graphic xmlns:a="http://schemas.openxmlformats.org/drawingml/2006/main">
-              <a:graphicData uri="http://schemas.openxmlformats.org/drawingml/2006/picture">
-                <pic:pic xmlns:pic="http://schemas.openxmlformats.org/drawingml/2006/picture">
-                  <pic:nvPicPr>
-                    <pic:cNvPr id="0" name="Picture 2"/>
-                    <pic:cNvPicPr>
-                      <a:picLocks noChangeAspect="1" noChangeArrowheads="1"/>
-                    </pic:cNvPicPr>
-                  </pic:nvPicPr>
-                  <pic:blipFill>
-                    <a:blip r:embed="rId8">
-                      <a:extLst>
-                        <a:ext uri="{28A0092B-C50C-407E-A947-70E740481C1C}">
-                          <a14:useLocalDpi xmlns:a14="http://schemas.microsoft.com/office/drawing/2010/main" val="0"/>
-                        </a:ext>
-                      </a:extLst>
-                    </a:blip>
-                    <a:srcRect/>
-                    <a:stretch>
-                      <a:fillRect/>
-                    </a:stretch>
-                  </pic:blipFill>
-                  <pic:spPr bwMode="auto">
-                    <a:xfrm>
-                      <a:off x="0" y="0"/>
-                      <a:ext cx="6115050" cy="7111365"/>
-                    </a:xfrm>
-                    <a:prstGeom prst="rect">
-                      <a:avLst/>
-                    </a:prstGeom>
-                    <a:noFill/>
-                    <a:ln>
-                      <a:noFill/>
-                    </a:ln>
-                  </pic:spPr>
-                </pic:pic>
-              </a:graphicData>
-            </a:graphic>
-          </wp:inline>
-        </w:drawing>
-      </w:r>
-      <w:proofErr w:type="gramStart"/>
-      <w:r>
-        <w:rPr>
-          <w:rFonts w:ascii="Times New Roman" w:eastAsia="新宋体" w:hAnsi="Times New Roman" w:hint="eastAsia"/>
-          <w:b/>
-          <w:szCs w:val="21"/>
-        </w:rPr>
-        <w:t>一</w:t>
-      </w:r>
-      <w:proofErr w:type="gramEnd"/>
-      <w:r>
-        <w:rPr>
-          <w:rFonts w:ascii="Times New Roman" w:eastAsia="新宋体" w:hAnsi="Times New Roman" w:hint="eastAsia"/>
-          <w:b/>
-          <w:szCs w:val="21"/>
-        </w:rPr>
-        <w:t>．解答题（共</w:t>
+          <w:szCs w:val="21"/>
+        </w:rPr>
+        <w:t>一．解答题（共</w:t>
       </w:r>
       <w:r>
         <w:rPr>
@@ -209,7 +86,6 @@
         </w:rPr>
         <w:t>）完成扫描的时间</w:t>
       </w:r>
-      <w:proofErr w:type="spellStart"/>
       <w:r>
         <w:rPr>
           <w:rFonts w:ascii="Times New Roman" w:eastAsia="新宋体" w:hAnsi="Times New Roman" w:hint="eastAsia"/>
@@ -218,7 +94,6 @@
         </w:rPr>
         <w:t>th</w:t>
       </w:r>
-      <w:proofErr w:type="spellEnd"/>
       <w:r>
         <w:rPr>
           <w:rFonts w:ascii="Times New Roman" w:eastAsia="新宋体" w:hAnsi="Times New Roman" w:hint="eastAsia"/>
@@ -571,7 +446,6 @@
           <w:rFonts w:ascii="Times New Roman" w:eastAsia="新宋体" w:hAnsi="Times New Roman" w:hint="eastAsia"/>
           <w:szCs w:val="21"/>
         </w:rPr>
-        <w:lastRenderedPageBreak/>
         <w:t>∴</w:t>
       </w:r>
       <m:oMath>
@@ -1116,7 +990,6 @@
         </w:rPr>
         <w:t>＝</w:t>
       </w:r>
-      <w:proofErr w:type="spellStart"/>
       <w:r>
         <w:rPr>
           <w:rFonts w:ascii="Times New Roman" w:eastAsia="新宋体" w:hAnsi="Times New Roman" w:hint="eastAsia"/>
@@ -1140,7 +1013,6 @@
         </w:rPr>
         <w:t>b</w:t>
       </w:r>
-      <w:proofErr w:type="spellEnd"/>
       <w:r>
         <w:rPr>
           <w:rFonts w:ascii="Times New Roman" w:eastAsia="新宋体" w:hAnsi="Times New Roman" w:hint="eastAsia"/>
@@ -1175,23 +1047,7 @@
           <w:rFonts w:ascii="Times New Roman" w:eastAsia="新宋体" w:hAnsi="Times New Roman" w:hint="eastAsia"/>
           <w:szCs w:val="21"/>
         </w:rPr>
-        <w:t>）</w:t>
-      </w:r>
-      <w:proofErr w:type="gramStart"/>
-      <w:r>
-        <w:rPr>
-          <w:rFonts w:ascii="Times New Roman" w:eastAsia="新宋体" w:hAnsi="Times New Roman" w:hint="eastAsia"/>
-          <w:szCs w:val="21"/>
-        </w:rPr>
-        <w:t>图象</w:t>
-      </w:r>
-      <w:proofErr w:type="gramEnd"/>
-      <w:r>
-        <w:rPr>
-          <w:rFonts w:ascii="Times New Roman" w:eastAsia="新宋体" w:hAnsi="Times New Roman" w:hint="eastAsia"/>
-          <w:szCs w:val="21"/>
-        </w:rPr>
-        <w:t>与反比例函数</w:t>
+        <w:t>）图象与反比例函数</w:t>
       </w:r>
       <m:oMath>
         <m:sSub>
@@ -1294,23 +1150,7 @@
           <w:rFonts w:ascii="Times New Roman" w:eastAsia="新宋体" w:hAnsi="Times New Roman" w:hint="eastAsia"/>
           <w:szCs w:val="21"/>
         </w:rPr>
-        <w:t>）</w:t>
-      </w:r>
-      <w:proofErr w:type="gramStart"/>
-      <w:r>
-        <w:rPr>
-          <w:rFonts w:ascii="Times New Roman" w:eastAsia="新宋体" w:hAnsi="Times New Roman" w:hint="eastAsia"/>
-          <w:szCs w:val="21"/>
-        </w:rPr>
-        <w:t>图象</w:t>
-      </w:r>
-      <w:proofErr w:type="gramEnd"/>
-      <w:r>
-        <w:rPr>
-          <w:rFonts w:ascii="Times New Roman" w:eastAsia="新宋体" w:hAnsi="Times New Roman" w:hint="eastAsia"/>
-          <w:szCs w:val="21"/>
-        </w:rPr>
-        <w:t>交于</w:t>
+        <w:t>）图象交于</w:t>
       </w:r>
       <w:r>
         <w:rPr>
@@ -1707,7 +1547,7 @@
                     </pic:cNvPicPr>
                   </pic:nvPicPr>
                   <pic:blipFill>
-                    <a:blip r:embed="rId9" cstate="print"/>
+                    <a:blip r:embed="rId7" cstate="print"/>
                     <a:stretch>
                       <a:fillRect/>
                     </a:stretch>
@@ -1858,23 +1698,7 @@
           <w:rFonts w:ascii="Times New Roman" w:eastAsia="新宋体" w:hAnsi="Times New Roman" w:hint="eastAsia"/>
           <w:szCs w:val="21"/>
         </w:rPr>
-        <w:t>）结合一次函数与反比例函数</w:t>
-      </w:r>
-      <w:proofErr w:type="gramStart"/>
-      <w:r>
-        <w:rPr>
-          <w:rFonts w:ascii="Times New Roman" w:eastAsia="新宋体" w:hAnsi="Times New Roman" w:hint="eastAsia"/>
-          <w:szCs w:val="21"/>
-        </w:rPr>
-        <w:t>图象</w:t>
-      </w:r>
-      <w:proofErr w:type="gramEnd"/>
-      <w:r>
-        <w:rPr>
-          <w:rFonts w:ascii="Times New Roman" w:eastAsia="新宋体" w:hAnsi="Times New Roman" w:hint="eastAsia"/>
-          <w:szCs w:val="21"/>
-        </w:rPr>
-        <w:t>，即可获得答案；</w:t>
+        <w:t>）结合一次函数与反比例函数图象，即可获得答案；</w:t>
       </w:r>
     </w:p>
     <w:p>
@@ -2288,6 +2112,7 @@
           <w:rFonts w:ascii="Times New Roman" w:eastAsia="新宋体" w:hAnsi="Times New Roman" w:hint="eastAsia"/>
           <w:szCs w:val="21"/>
         </w:rPr>
+        <w:lastRenderedPageBreak/>
         <w:t>∴</w:t>
       </w:r>
       <w:r>
@@ -2602,23 +2427,7 @@
           <w:rFonts w:ascii="Times New Roman" w:eastAsia="新宋体" w:hAnsi="Times New Roman" w:hint="eastAsia"/>
           <w:szCs w:val="21"/>
         </w:rPr>
-        <w:t>）由</w:t>
-      </w:r>
-      <w:proofErr w:type="gramStart"/>
-      <w:r>
-        <w:rPr>
-          <w:rFonts w:ascii="Times New Roman" w:eastAsia="新宋体" w:hAnsi="Times New Roman" w:hint="eastAsia"/>
-          <w:szCs w:val="21"/>
-        </w:rPr>
-        <w:t>图象</w:t>
-      </w:r>
-      <w:proofErr w:type="gramEnd"/>
-      <w:r>
-        <w:rPr>
-          <w:rFonts w:ascii="Times New Roman" w:eastAsia="新宋体" w:hAnsi="Times New Roman" w:hint="eastAsia"/>
-          <w:szCs w:val="21"/>
-        </w:rPr>
-        <w:t>可知，当</w:t>
+        <w:t>）由图象可知，当</w:t>
       </w:r>
       <w:r>
         <w:rPr>
@@ -2765,7 +2574,6 @@
           <w:rFonts w:ascii="Times New Roman" w:eastAsia="新宋体" w:hAnsi="Times New Roman" w:hint="eastAsia"/>
           <w:szCs w:val="21"/>
         </w:rPr>
-        <w:lastRenderedPageBreak/>
         <w:t>（</w:t>
       </w:r>
       <w:r>
@@ -3395,23 +3203,7 @@
           <w:rFonts w:ascii="Times New Roman" w:eastAsia="新宋体" w:hAnsi="Times New Roman" w:hint="eastAsia"/>
           <w:szCs w:val="21"/>
         </w:rPr>
-        <w:t>本题主要考查了求一次函数和反比例函数解析式、一次函数</w:t>
-      </w:r>
-      <w:proofErr w:type="gramStart"/>
-      <w:r>
-        <w:rPr>
-          <w:rFonts w:ascii="Times New Roman" w:eastAsia="新宋体" w:hAnsi="Times New Roman" w:hint="eastAsia"/>
-          <w:szCs w:val="21"/>
-        </w:rPr>
-        <w:t>图象</w:t>
-      </w:r>
-      <w:proofErr w:type="gramEnd"/>
-      <w:r>
-        <w:rPr>
-          <w:rFonts w:ascii="Times New Roman" w:eastAsia="新宋体" w:hAnsi="Times New Roman" w:hint="eastAsia"/>
-          <w:szCs w:val="21"/>
-        </w:rPr>
-        <w:t>与坐标轴交点、一次函数与反比例函数综合应用等知识，解题关键是运用数形结合的思想分析问题．</w:t>
+        <w:t>本题主要考查了求一次函数和反比例函数解析式、一次函数图象与坐标轴交点、一次函数与反比例函数综合应用等知识，解题关键是运用数形结合的思想分析问题．</w:t>
       </w:r>
     </w:p>
     <w:p>
@@ -3467,23 +3259,7 @@
           <w:rFonts w:ascii="Times New Roman" w:eastAsia="新宋体" w:hAnsi="Times New Roman" w:hint="eastAsia"/>
           <w:szCs w:val="21"/>
         </w:rPr>
-        <w:t>的</w:t>
-      </w:r>
-      <w:proofErr w:type="gramStart"/>
-      <w:r>
-        <w:rPr>
-          <w:rFonts w:ascii="Times New Roman" w:eastAsia="新宋体" w:hAnsi="Times New Roman" w:hint="eastAsia"/>
-          <w:szCs w:val="21"/>
-        </w:rPr>
-        <w:t>图象</w:t>
-      </w:r>
-      <w:proofErr w:type="gramEnd"/>
-      <w:r>
-        <w:rPr>
-          <w:rFonts w:ascii="Times New Roman" w:eastAsia="新宋体" w:hAnsi="Times New Roman" w:hint="eastAsia"/>
-          <w:szCs w:val="21"/>
-        </w:rPr>
-        <w:t>与反比例函数</w:t>
+        <w:t>的图象与反比例函数</w:t>
       </w:r>
       <m:oMath>
         <m:r>
@@ -3566,23 +3342,7 @@
           <w:rFonts w:ascii="Times New Roman" w:eastAsia="新宋体" w:hAnsi="Times New Roman" w:hint="eastAsia"/>
           <w:szCs w:val="21"/>
         </w:rPr>
-        <w:t>）的</w:t>
-      </w:r>
-      <w:proofErr w:type="gramStart"/>
-      <w:r>
-        <w:rPr>
-          <w:rFonts w:ascii="Times New Roman" w:eastAsia="新宋体" w:hAnsi="Times New Roman" w:hint="eastAsia"/>
-          <w:szCs w:val="21"/>
-        </w:rPr>
-        <w:t>图象</w:t>
-      </w:r>
-      <w:proofErr w:type="gramEnd"/>
-      <w:r>
-        <w:rPr>
-          <w:rFonts w:ascii="Times New Roman" w:eastAsia="新宋体" w:hAnsi="Times New Roman" w:hint="eastAsia"/>
-          <w:szCs w:val="21"/>
-        </w:rPr>
-        <w:t>交于</w:t>
+        <w:t>）的图象交于</w:t>
       </w:r>
       <w:r>
         <w:rPr>
@@ -4004,7 +3764,7 @@
                     </pic:cNvPicPr>
                   </pic:nvPicPr>
                   <pic:blipFill>
-                    <a:blip r:embed="rId10" cstate="print"/>
+                    <a:blip r:embed="rId8" cstate="print"/>
                     <a:stretch>
                       <a:fillRect/>
                     </a:stretch>
@@ -4112,23 +3872,7 @@
           <w:rFonts w:ascii="Times New Roman" w:eastAsia="新宋体" w:hAnsi="Times New Roman" w:hint="eastAsia"/>
           <w:szCs w:val="21"/>
         </w:rPr>
-        <w:t>的横坐标，再结合</w:t>
-      </w:r>
-      <w:proofErr w:type="gramStart"/>
-      <w:r>
-        <w:rPr>
-          <w:rFonts w:ascii="Times New Roman" w:eastAsia="新宋体" w:hAnsi="Times New Roman" w:hint="eastAsia"/>
-          <w:szCs w:val="21"/>
-        </w:rPr>
-        <w:t>图象</w:t>
-      </w:r>
-      <w:proofErr w:type="gramEnd"/>
-      <w:r>
-        <w:rPr>
-          <w:rFonts w:ascii="Times New Roman" w:eastAsia="新宋体" w:hAnsi="Times New Roman" w:hint="eastAsia"/>
-          <w:szCs w:val="21"/>
-        </w:rPr>
-        <w:t>，求出直线在双曲线上方时对应的自变量的取值范围即可；</w:t>
+        <w:t>的横坐标，再结合图象，求出直线在双曲线上方时对应的自变量的取值范围即可；</w:t>
       </w:r>
     </w:p>
     <w:p>
@@ -4728,6 +4472,7 @@
           <w:rFonts w:ascii="Times New Roman" w:eastAsia="新宋体" w:hAnsi="Times New Roman" w:hint="eastAsia"/>
           <w:szCs w:val="21"/>
         </w:rPr>
+        <w:lastRenderedPageBreak/>
         <w:t>（</w:t>
       </w:r>
       <w:r>
@@ -5188,7 +4933,6 @@
           <w:rFonts w:ascii="Times New Roman" w:eastAsia="新宋体" w:hAnsi="Times New Roman" w:hint="eastAsia"/>
           <w:szCs w:val="21"/>
         </w:rPr>
-        <w:lastRenderedPageBreak/>
         <w:t>故答案为：</w:t>
       </w:r>
       <w:r>
@@ -5363,7 +5107,7 @@
                     </pic:cNvPicPr>
                   </pic:nvPicPr>
                   <pic:blipFill>
-                    <a:blip r:embed="rId11" cstate="print"/>
+                    <a:blip r:embed="rId9" cstate="print"/>
                     <a:stretch>
                       <a:fillRect/>
                     </a:stretch>
@@ -6312,23 +6056,7 @@
           <w:rFonts w:ascii="Times New Roman" w:eastAsia="新宋体" w:hAnsi="Times New Roman" w:hint="eastAsia"/>
           <w:szCs w:val="21"/>
         </w:rPr>
-        <w:t>本题考查了一次函数与反比例函数的交点问题，熟练掌握</w:t>
-      </w:r>
-      <w:proofErr w:type="gramStart"/>
-      <w:r>
-        <w:rPr>
-          <w:rFonts w:ascii="Times New Roman" w:eastAsia="新宋体" w:hAnsi="Times New Roman" w:hint="eastAsia"/>
-          <w:szCs w:val="21"/>
-        </w:rPr>
-        <w:t>该知识</w:t>
-      </w:r>
-      <w:proofErr w:type="gramEnd"/>
-      <w:r>
-        <w:rPr>
-          <w:rFonts w:ascii="Times New Roman" w:eastAsia="新宋体" w:hAnsi="Times New Roman" w:hint="eastAsia"/>
-          <w:szCs w:val="21"/>
-        </w:rPr>
-        <w:t>点是关键．</w:t>
+        <w:t>本题考查了一次函数与反比例函数的交点问题，熟练掌握该知识点是关键．</w:t>
       </w:r>
     </w:p>
     <w:p>
@@ -6651,23 +6379,7 @@
           <w:rFonts w:ascii="Times New Roman" w:eastAsia="新宋体" w:hAnsi="Times New Roman" w:hint="eastAsia"/>
           <w:szCs w:val="21"/>
         </w:rPr>
-        <w:t>的</w:t>
-      </w:r>
-      <w:proofErr w:type="gramStart"/>
-      <w:r>
-        <w:rPr>
-          <w:rFonts w:ascii="Times New Roman" w:eastAsia="新宋体" w:hAnsi="Times New Roman" w:hint="eastAsia"/>
-          <w:szCs w:val="21"/>
-        </w:rPr>
-        <w:t>图象</w:t>
-      </w:r>
-      <w:proofErr w:type="gramEnd"/>
-      <w:r>
-        <w:rPr>
-          <w:rFonts w:ascii="Times New Roman" w:eastAsia="新宋体" w:hAnsi="Times New Roman" w:hint="eastAsia"/>
-          <w:szCs w:val="21"/>
-        </w:rPr>
-        <w:t>与</w:t>
+        <w:t>的图象与</w:t>
       </w:r>
       <w:r>
         <w:rPr>
@@ -6946,6 +6658,7 @@
           <w:noProof/>
           <w:szCs w:val="21"/>
         </w:rPr>
+        <w:lastRenderedPageBreak/>
         <w:drawing>
           <wp:inline distT="0" distB="0" distL="0" distR="0" wp14:anchorId="012FC765" wp14:editId="21011448">
             <wp:extent cx="1852930" cy="1395730"/>
@@ -6964,7 +6677,7 @@
                     </pic:cNvPicPr>
                   </pic:nvPicPr>
                   <pic:blipFill>
-                    <a:blip r:embed="rId12" cstate="print"/>
+                    <a:blip r:embed="rId10" cstate="print"/>
                     <a:stretch>
                       <a:fillRect/>
                     </a:stretch>
@@ -7411,31 +7124,7 @@
           <w:rFonts w:ascii="Times New Roman" w:eastAsia="新宋体" w:hAnsi="Times New Roman" w:hint="eastAsia"/>
           <w:szCs w:val="21"/>
         </w:rPr>
-        <w:t>，可根据各点坐</w:t>
-      </w:r>
-      <w:r>
-        <w:rPr>
-          <w:rFonts w:ascii="Times New Roman" w:eastAsia="新宋体" w:hAnsi="Times New Roman" w:hint="eastAsia"/>
-          <w:szCs w:val="21"/>
-        </w:rPr>
-        <w:lastRenderedPageBreak/>
-        <w:t>标求出各三角形的面积，</w:t>
-      </w:r>
-      <w:proofErr w:type="gramStart"/>
-      <w:r>
-        <w:rPr>
-          <w:rFonts w:ascii="Times New Roman" w:eastAsia="新宋体" w:hAnsi="Times New Roman" w:hint="eastAsia"/>
-          <w:szCs w:val="21"/>
-        </w:rPr>
-        <w:t>然后代值求解</w:t>
-      </w:r>
-      <w:proofErr w:type="gramEnd"/>
-      <w:r>
-        <w:rPr>
-          <w:rFonts w:ascii="Times New Roman" w:eastAsia="新宋体" w:hAnsi="Times New Roman" w:hint="eastAsia"/>
-          <w:szCs w:val="21"/>
-        </w:rPr>
-        <w:t>即可；</w:t>
+        <w:t>，可根据各点坐标求出各三角形的面积，然后代值求解即可；</w:t>
       </w:r>
     </w:p>
     <w:p>
@@ -9719,6 +9408,7 @@
           <w:rFonts w:ascii="Times New Roman" w:eastAsia="新宋体" w:hAnsi="Times New Roman" w:hint="eastAsia"/>
           <w:szCs w:val="21"/>
         </w:rPr>
+        <w:lastRenderedPageBreak/>
         <w:t>∴△</w:t>
       </w:r>
       <w:r>
@@ -10498,7 +10188,6 @@
           <w:color w:val="0000FF"/>
           <w:szCs w:val="21"/>
         </w:rPr>
-        <w:lastRenderedPageBreak/>
         <w:t>【点评】</w:t>
       </w:r>
       <w:r>
@@ -11580,7 +11269,6 @@
         </w:rPr>
         <w:t>，求∠</w:t>
       </w:r>
-      <w:proofErr w:type="spellStart"/>
       <w:r>
         <w:rPr>
           <w:rFonts w:ascii="Times New Roman" w:eastAsia="新宋体" w:hAnsi="Times New Roman" w:hint="eastAsia"/>
@@ -11589,7 +11277,6 @@
         </w:rPr>
         <w:t>A</w:t>
       </w:r>
-      <w:proofErr w:type="spellEnd"/>
       <w:r>
         <w:rPr>
           <w:rFonts w:ascii="Times New Roman" w:eastAsia="新宋体" w:hAnsi="Times New Roman" w:hint="eastAsia"/>
@@ -12060,7 +11747,6 @@
         </w:rPr>
         <w:t>则</w:t>
       </w:r>
-      <w:proofErr w:type="spellStart"/>
       <w:r>
         <w:rPr>
           <w:rFonts w:ascii="Times New Roman" w:eastAsia="新宋体" w:hAnsi="Times New Roman" w:hint="eastAsia"/>
@@ -12076,7 +11762,6 @@
         </w:rPr>
         <w:t>A</w:t>
       </w:r>
-      <w:proofErr w:type="spellEnd"/>
       <m:oMath>
         <m:r>
           <w:rPr>
@@ -12557,7 +12242,6 @@
         </w:rPr>
         <w:t>•</w:t>
       </w:r>
-      <w:proofErr w:type="spellStart"/>
       <w:r>
         <w:rPr>
           <w:rFonts w:ascii="Times New Roman" w:eastAsia="新宋体" w:hAnsi="Times New Roman" w:hint="eastAsia"/>
@@ -12573,7 +12257,6 @@
         </w:rPr>
         <w:t>A</w:t>
       </w:r>
-      <w:proofErr w:type="spellEnd"/>
       <w:r>
         <w:rPr>
           <w:rFonts w:ascii="Times New Roman" w:eastAsia="新宋体" w:hAnsi="Times New Roman" w:hint="eastAsia"/>
@@ -12712,7 +12395,6 @@
         </w:rPr>
         <w:t>•</w:t>
       </w:r>
-      <w:proofErr w:type="spellStart"/>
       <w:r>
         <w:rPr>
           <w:rFonts w:ascii="Times New Roman" w:eastAsia="新宋体" w:hAnsi="Times New Roman" w:hint="eastAsia"/>
@@ -12728,7 +12410,6 @@
         </w:rPr>
         <w:t>A</w:t>
       </w:r>
-      <w:proofErr w:type="spellEnd"/>
       <w:r>
         <w:rPr>
           <w:rFonts w:ascii="Times New Roman" w:eastAsia="新宋体" w:hAnsi="Times New Roman" w:hint="eastAsia"/>
@@ -12864,7 +12545,15 @@
           <w:rFonts w:ascii="Times New Roman" w:eastAsia="新宋体" w:hAnsi="Times New Roman" w:hint="eastAsia"/>
           <w:szCs w:val="21"/>
         </w:rPr>
-        <w:t>本题考查的是解直角三角形，掌握锐角三角函数的定义、熟记特殊角的三角函数值是解题的关键．</w:t>
+        <w:t>本题考查的是解直角三角形，掌握锐角三角函数的定义、熟记特殊角的三角函数值是解题的关</w:t>
+      </w:r>
+      <w:r>
+        <w:rPr>
+          <w:rFonts w:ascii="Times New Roman" w:eastAsia="新宋体" w:hAnsi="Times New Roman" w:hint="eastAsia"/>
+          <w:szCs w:val="21"/>
+        </w:rPr>
+        <w:lastRenderedPageBreak/>
+        <w:t>键．</w:t>
       </w:r>
     </w:p>
     <w:p>
@@ -13072,7 +12761,6 @@
         </w:rPr>
         <w:t>AB</w:t>
       </w:r>
-      <w:proofErr w:type="gramStart"/>
       <w:r>
         <w:rPr>
           <w:rFonts w:ascii="Times New Roman" w:eastAsia="新宋体" w:hAnsi="Times New Roman" w:hint="eastAsia"/>
@@ -13080,7 +12768,6 @@
         </w:rPr>
         <w:t>的坡角为</w:t>
       </w:r>
-      <w:proofErr w:type="gramEnd"/>
       <w:r>
         <w:rPr>
           <w:rFonts w:ascii="Times New Roman" w:eastAsia="新宋体" w:hAnsi="Times New Roman" w:hint="eastAsia"/>
@@ -13153,7 +12840,7 @@
                     </pic:cNvPicPr>
                   </pic:nvPicPr>
                   <pic:blipFill>
-                    <a:blip r:embed="rId13" cstate="print"/>
+                    <a:blip r:embed="rId11" cstate="print"/>
                     <a:stretch>
                       <a:fillRect/>
                     </a:stretch>
@@ -13342,15 +13029,7 @@
           <w:rFonts w:ascii="Times New Roman" w:eastAsia="新宋体" w:hAnsi="Times New Roman" w:hint="eastAsia"/>
           <w:szCs w:val="21"/>
         </w:rPr>
-        <w:t>处大约需要多少</w:t>
-      </w:r>
-      <w:r>
-        <w:rPr>
-          <w:rFonts w:ascii="Times New Roman" w:eastAsia="新宋体" w:hAnsi="Times New Roman" w:hint="eastAsia"/>
-          <w:szCs w:val="21"/>
-        </w:rPr>
-        <w:lastRenderedPageBreak/>
-        <w:t>分钟（结果精确到</w:t>
+        <w:t>处大约需要多少分钟（结果精确到</w:t>
       </w:r>
       <w:r>
         <w:rPr>
@@ -13686,7 +13365,7 @@
                     </pic:cNvPicPr>
                   </pic:nvPicPr>
                   <pic:blipFill>
-                    <a:blip r:embed="rId14" cstate="print"/>
+                    <a:blip r:embed="rId12" cstate="print"/>
                     <a:stretch>
                       <a:fillRect/>
                     </a:stretch>
@@ -13800,7 +13479,6 @@
         </w:rPr>
         <w:t>AB</w:t>
       </w:r>
-      <w:proofErr w:type="gramStart"/>
       <w:r>
         <w:rPr>
           <w:rFonts w:ascii="Times New Roman" w:eastAsia="新宋体" w:hAnsi="Times New Roman" w:hint="eastAsia"/>
@@ -13808,7 +13486,6 @@
         </w:rPr>
         <w:t>的坡角为</w:t>
       </w:r>
-      <w:proofErr w:type="gramEnd"/>
       <w:r>
         <w:rPr>
           <w:rFonts w:ascii="Times New Roman" w:eastAsia="新宋体" w:hAnsi="Times New Roman" w:hint="eastAsia"/>
@@ -15115,6 +14792,7 @@
           <w:noProof/>
           <w:szCs w:val="21"/>
         </w:rPr>
+        <w:lastRenderedPageBreak/>
         <w:drawing>
           <wp:inline distT="0" distB="0" distL="0" distR="0" wp14:anchorId="02AD95FB" wp14:editId="585F7D32">
             <wp:extent cx="2745740" cy="1795145"/>
@@ -15133,7 +14811,7 @@
                     </pic:cNvPicPr>
                   </pic:nvPicPr>
                   <pic:blipFill>
-                    <a:blip r:embed="rId15" cstate="print"/>
+                    <a:blip r:embed="rId13" cstate="print"/>
                     <a:stretch>
                       <a:fillRect/>
                     </a:stretch>
@@ -15386,7 +15064,6 @@
         </w:rPr>
         <w:t>＝</w:t>
       </w:r>
-      <w:proofErr w:type="spellStart"/>
       <w:r>
         <w:rPr>
           <w:rFonts w:ascii="Times New Roman" w:eastAsia="新宋体" w:hAnsi="Times New Roman" w:hint="eastAsia"/>
@@ -15395,7 +15072,6 @@
         </w:rPr>
         <w:t>xm</w:t>
       </w:r>
-      <w:proofErr w:type="spellEnd"/>
       <w:r>
         <w:rPr>
           <w:rFonts w:ascii="Times New Roman" w:eastAsia="新宋体" w:hAnsi="Times New Roman" w:hint="eastAsia"/>
@@ -15866,7 +15542,6 @@
         </w:rPr>
         <w:t>＝</w:t>
       </w:r>
-      <w:proofErr w:type="spellStart"/>
       <w:r>
         <w:rPr>
           <w:rFonts w:ascii="Times New Roman" w:eastAsia="新宋体" w:hAnsi="Times New Roman" w:hint="eastAsia"/>
@@ -15875,7 +15550,6 @@
         </w:rPr>
         <w:t>xm</w:t>
       </w:r>
-      <w:proofErr w:type="spellEnd"/>
       <w:r>
         <w:rPr>
           <w:rFonts w:ascii="Times New Roman" w:eastAsia="新宋体" w:hAnsi="Times New Roman" w:hint="eastAsia"/>
@@ -16053,7 +15727,6 @@
           <w:rFonts w:ascii="Times New Roman" w:eastAsia="新宋体" w:hAnsi="Times New Roman" w:hint="eastAsia"/>
           <w:szCs w:val="21"/>
         </w:rPr>
-        <w:lastRenderedPageBreak/>
         <w:t>在</w:t>
       </w:r>
       <w:r>
@@ -17094,7 +16767,7 @@
                     </pic:cNvPicPr>
                   </pic:nvPicPr>
                   <pic:blipFill>
-                    <a:blip r:embed="rId8">
+                    <a:blip r:embed="rId14">
                       <a:extLst>
                         <a:ext uri="{28A0092B-C50C-407E-A947-70E740481C1C}">
                           <a14:useLocalDpi xmlns:a14="http://schemas.microsoft.com/office/drawing/2010/main" val="0"/>
@@ -17157,7 +16830,7 @@
                     </pic:cNvPicPr>
                   </pic:nvPicPr>
                   <pic:blipFill>
-                    <a:blip r:embed="rId7">
+                    <a:blip r:embed="rId15">
                       <a:extLst>
                         <a:ext uri="{28A0092B-C50C-407E-A947-70E740481C1C}">
                           <a14:useLocalDpi xmlns:a14="http://schemas.microsoft.com/office/drawing/2010/main" val="0"/>

</xml_diff>